<commit_message>
Finish Gabriel deliverable rebuild
</commit_message>
<xml_diff>
--- a/instructivos/finales/RECEPCION_DE_MADERA_guia_v2_ACTUALIZADO_2026-06-19.docx
+++ b/instructivos/finales/RECEPCION_DE_MADERA_guia_v2_ACTUALIZADO_2026-06-19.docx
@@ -474,7 +474,7 @@
                 <w:vertAlign w:val="baseline"/>
                 <w:rtl w:val="0"/>
               </w:rPr>
-              <w:t xml:space="preserve">Ingresos Terceros — con QR</w:t>
+              <w:t xml:space="preserve">Ingresos Terceros — con código de barras</w:t>
               <w:tab/>
               <w:t xml:space="preserve">8</w:t>
             </w:r>
@@ -685,7 +685,7 @@
                 <w:vertAlign w:val="baseline"/>
                 <w:rtl w:val="0"/>
               </w:rPr>
-              <w:t xml:space="preserve">Ingresos Terceros — sin QR</w:t>
+              <w:t xml:space="preserve">Ingresos Terceros — sin código de barras</w:t>
               <w:tab/>
               <w:t xml:space="preserve">11</w:t>
             </w:r>
@@ -1527,7 +1527,7 @@
         <w:rPr>
           <w:rtl w:val="0"/>
         </w:rPr>
-        <w:t xml:space="preserve">Para recibir madera usamos el sistema ANI y dos balanzas que pesan el camión solas. Hay tres tipos de ingreso: Propios, Vuelo Forestal y Terceros. Cada uno se puede hacer con QR (rápido) o sin QR (manual).</w:t>
+        <w:t>Para recibir madera usamos el sistema ANI y dos balanzas que pesan el camión solas. Hay tres tipos de ingreso: Propios, Vuelo Forestal y Terceros. Propios y Vuelo Forestal usan QR forestal cuando existe; Terceros usa código de barras del proveedor. Si no hay QR forestal o código de barras, el ingreso se llena manualmente.</w:t>
       </w:r>
     </w:p>
     <w:p>
@@ -2017,39 +2017,7 @@
         <w:rPr>
           <w:rtl w:val="0"/>
         </w:rPr>
-        <w:t xml:space="preserve">Cuando los campos estén listos, aprieta </w:t>
-      </w:r>
-      <w:r>
-        <w:rPr>
-          <w:rFonts w:ascii="Consolas" w:cs="Consolas" w:eastAsia="Consolas" w:hAnsi="Consolas"/>
-          <w:b w:val="1"/>
-          <w:bCs w:val="1"/>
-          <w:shd w:fill="f5f5f5" w:val="clear"/>
-          <w:rtl w:val="0"/>
-        </w:rPr>
-        <w:t xml:space="preserve"> F4 </w:t>
-      </w:r>
-      <w:r>
-        <w:rPr>
-          <w:rtl w:val="0"/>
-        </w:rPr>
-        <w:t xml:space="preserve">. La balanza pasa el peso al sistema. Confirmas con </w:t>
-      </w:r>
-      <w:r>
-        <w:rPr>
-          <w:rFonts w:ascii="Consolas" w:cs="Consolas" w:eastAsia="Consolas" w:hAnsi="Consolas"/>
-          <w:b w:val="1"/>
-          <w:bCs w:val="1"/>
-          <w:shd w:fill="f5f5f5" w:val="clear"/>
-          <w:rtl w:val="0"/>
-        </w:rPr>
-        <w:t xml:space="preserve"> OK </w:t>
-      </w:r>
-      <w:r>
-        <w:rPr>
-          <w:rtl w:val="0"/>
-        </w:rPr>
-        <w:t xml:space="preserve">.</w:t>
+        <w:t xml:space="preserve">Cuando los datos mínimos estén completos y revisados, aprieta  F4 . La balanza pasa el peso al sistema. Confirmas con  OK .</w:t>
       </w:r>
     </w:p>
     <w:p>
@@ -2627,12 +2595,7 @@
           <w:color w:val="173404"/>
           <w:rtl w:val="0"/>
         </w:rPr>
-        <w:t xml:space="preserve">Ingresos Terceros — con QR</w:t>
-      </w:r>
-      <w:r>
-        <w:rPr>
-          <w:rtl w:val="0"/>
-        </w:rPr>
+        <w:t>Ingresos Terceros — con código de barras</w:t>
       </w:r>
     </w:p>
     <w:p>
@@ -2822,47 +2785,7 @@
           <w:szCs w:val="20"/>
           <w:rtl w:val="0"/>
         </w:rPr>
-        <w:t xml:space="preserve">Código de barras del proveedor — se autocompleta con el qr:</w:t>
-      </w:r>
-      <w:r>
-        <w:rPr/>
-        <w:drawing>
-          <wp:inline distB="0" distT="0" distL="0" distR="0">
-            <wp:extent cx="5715000" cy="276225"/>
-            <wp:effectExtent b="0" l="0" r="0" t="0"/>
-            <wp:docPr descr="image12.png" id="11" name="image1.png"/>
-            <a:graphic>
-              <a:graphicData uri="http://schemas.openxmlformats.org/drawingml/2006/picture">
-                <pic:pic>
-                  <pic:nvPicPr>
-                    <pic:cNvPr descr="image12.png" id="0" name="image1.png"/>
-                    <pic:cNvPicPr preferRelativeResize="0"/>
-                  </pic:nvPicPr>
-                  <pic:blipFill>
-                    <a:blip r:embed="rId19"/>
-                    <a:srcRect b="0" l="0" r="0" t="0"/>
-                    <a:stretch>
-                      <a:fillRect/>
-                    </a:stretch>
-                  </pic:blipFill>
-                  <pic:spPr>
-                    <a:xfrm>
-                      <a:off x="0" y="0"/>
-                      <a:ext cx="5715000" cy="276225"/>
-                    </a:xfrm>
-                    <a:prstGeom prst="rect"/>
-                    <a:ln/>
-                  </pic:spPr>
-                </pic:pic>
-              </a:graphicData>
-            </a:graphic>
-          </wp:inline>
-        </w:drawing>
-      </w:r>
-      <w:r>
-        <w:rPr>
-          <w:rtl w:val="0"/>
-        </w:rPr>
+        <w:t>Código de barras del proveedor — ayuda a completar datos del proveedor:</w:t>
       </w:r>
     </w:p>
     <w:p>
@@ -3121,23 +3044,7 @@
         <w:rPr>
           <w:rtl w:val="0"/>
         </w:rPr>
-        <w:t xml:space="preserve">Aprieta </w:t>
-      </w:r>
-      <w:r>
-        <w:rPr>
-          <w:rFonts w:ascii="Consolas" w:cs="Consolas" w:eastAsia="Consolas" w:hAnsi="Consolas"/>
-          <w:b w:val="1"/>
-          <w:bCs w:val="1"/>
-          <w:shd w:fill="f5f5f5" w:val="clear"/>
-          <w:rtl w:val="0"/>
-        </w:rPr>
-        <w:t xml:space="preserve"> F4 </w:t>
-      </w:r>
-      <w:r>
-        <w:rPr>
-          <w:rtl w:val="0"/>
-        </w:rPr>
-        <w:t xml:space="preserve"> para que la balanza pase el peso. Verifica primero que el peso de balanza esté en 0.</w:t>
+        <w:t xml:space="preserve">Cuando los datos mínimos estén completos y revisados, aprieta  F4  para que la balanza pase el peso. Verifica primero que el peso de balanza esté en 0.</w:t>
       </w:r>
     </w:p>
     <w:p>
@@ -3370,12 +3277,7 @@
           <w:color w:val="173404"/>
           <w:rtl w:val="0"/>
         </w:rPr>
-        <w:t xml:space="preserve">Ingresos Terceros — sin QR</w:t>
-      </w:r>
-      <w:r>
-        <w:rPr>
-          <w:rtl w:val="0"/>
-        </w:rPr>
+        <w:t>Ingresos Terceros — sin código de barras</w:t>
       </w:r>
     </w:p>
     <w:p>
@@ -3387,7 +3289,7 @@
         <w:rPr>
           <w:rtl w:val="0"/>
         </w:rPr>
-        <w:t xml:space="preserve">Si el QR no sirve o no está, el ingreso lo haces a mano. Llenas tú lo que normalmente traería el QR.</w:t>
+        <w:t>Si el código de barras no está o no sirve, el ingreso lo haces a mano: placa, proveedor, guía, transportista, material, categoría y ubicación.</w:t>
       </w:r>
     </w:p>
     <w:p>
@@ -3824,55 +3726,7 @@
         <w:rPr>
           <w:rtl w:val="0"/>
         </w:rPr>
-        <w:t xml:space="preserve">Verifica que el peso de balanza esté en 0. Aprieta </w:t>
-      </w:r>
-      <w:r>
-        <w:rPr>
-          <w:rFonts w:ascii="Consolas" w:cs="Consolas" w:eastAsia="Consolas" w:hAnsi="Consolas"/>
-          <w:b w:val="1"/>
-          <w:bCs w:val="1"/>
-          <w:shd w:fill="f5f5f5" w:val="clear"/>
-          <w:rtl w:val="0"/>
-        </w:rPr>
-        <w:t xml:space="preserve"> F4 </w:t>
-      </w:r>
-      <w:r>
-        <w:rPr>
-          <w:rtl w:val="0"/>
-        </w:rPr>
-        <w:t xml:space="preserve"> para capturar el peso, confirma con </w:t>
-      </w:r>
-      <w:r>
-        <w:rPr>
-          <w:rFonts w:ascii="Consolas" w:cs="Consolas" w:eastAsia="Consolas" w:hAnsi="Consolas"/>
-          <w:b w:val="1"/>
-          <w:bCs w:val="1"/>
-          <w:shd w:fill="f5f5f5" w:val="clear"/>
-          <w:rtl w:val="0"/>
-        </w:rPr>
-        <w:t xml:space="preserve"> OK </w:t>
-      </w:r>
-      <w:r>
-        <w:rPr>
-          <w:rtl w:val="0"/>
-        </w:rPr>
-        <w:t xml:space="preserve"> o </w:t>
-      </w:r>
-      <w:r>
-        <w:rPr>
-          <w:rFonts w:ascii="Consolas" w:cs="Consolas" w:eastAsia="Consolas" w:hAnsi="Consolas"/>
-          <w:b w:val="1"/>
-          <w:bCs w:val="1"/>
-          <w:shd w:fill="f5f5f5" w:val="clear"/>
-          <w:rtl w:val="0"/>
-        </w:rPr>
-        <w:t xml:space="preserve"> F12 </w:t>
-      </w:r>
-      <w:r>
-        <w:rPr>
-          <w:rtl w:val="0"/>
-        </w:rPr>
-        <w:t xml:space="preserve">.</w:t>
+        <w:t xml:space="preserve">Verifica que los datos mínimos estén completos y que la balanza esté en 0. Aprieta  F4  para capturar el peso, confirma con  OK  o  F12 .</w:t>
       </w:r>
     </w:p>
     <w:p>
@@ -4382,13 +4236,11 @@
         <w:pStyle w:val="Heading1"/>
         <w:rPr/>
       </w:pPr>
-      <w:bookmarkStart w:colFirst="0" w:colLast="0" w:name="_heading=h.bjsdk98omtz1" w:id="1"/>
-      <w:bookmarkEnd w:id="1"/>
-      <w:r>
-        <w:rPr>
-          <w:rtl w:val="0"/>
-        </w:rPr>
-        <w:t xml:space="preserve">Ingresos terceros — sin QR</w:t>
+      <w:r>
+        <w:rPr>
+          <w:rtl w:val="0"/>
+        </w:rPr>
+        <w:t>Ingresos terceros — sin código de barras</w:t>
       </w:r>
     </w:p>
     <w:p>
@@ -4400,7 +4252,7 @@
         <w:rPr>
           <w:rtl w:val="0"/>
         </w:rPr>
-        <w:t xml:space="preserve">Si el QR no sirve o no está, el ingreso lo haces a mano. Llenas tú lo que normalmente traería el QR.</w:t>
+        <w:t>Si el código de barras no está o no sirve, el ingreso lo haces a mano: placa, proveedor, guía, transportista, material, categoría y ubicación.</w:t>
       </w:r>
     </w:p>
     <w:p>
@@ -5398,7 +5250,7 @@
         <w:rPr>
           <w:rtl w:val="0"/>
         </w:rPr>
-        <w:t xml:space="preserve">ANI revisa solo que la guía no esté duplicada en el sistema. Si la rechaza:</w:t>
+        <w:t>ANI revisa que la guía no esté duplicada en el sistema y bloquea la entrada si ya existe. Si la rechaza:</w:t>
       </w:r>
     </w:p>
     <w:p>
@@ -5527,7 +5379,7 @@
           <w:vertAlign w:val="baseline"/>
           <w:rtl w:val="0"/>
         </w:rPr>
-        <w:t xml:space="preserve">No dejes descargar hasta que la guía sea válida</w:t>
+        <w:t>No dejes pasar el ingreso hasta que la guía sea válida</w:t>
       </w:r>
     </w:p>
     <w:p>
@@ -5579,19 +5431,6 @@
     </w:p>
     <w:p>
       <w:pPr>
-        <w:rPr/>
-      </w:pPr>
-      <w:r>
-        <w:br w:type="page"/>
-      </w:r>
-      <w:r>
-        <w:rPr>
-          <w:rtl w:val="0"/>
-        </w:rPr>
-      </w:r>
-    </w:p>
-    <w:p>
-      <w:pPr>
         <w:pStyle w:val="Heading1"/>
         <w:spacing w:after="200" w:before="320" w:lineRule="auto"/>
         <w:rPr/>
@@ -5603,6 +5442,71 @@
           <w:color w:val="173404"/>
           <w:rtl w:val="0"/>
         </w:rPr>
+        <w:t>Control de humedad y muestra</w:t>
+      </w:r>
+    </w:p>
+    <w:p>
+      <w:pPr>
+        <w:spacing w:after="120" w:lineRule="auto"/>
+        <w:rPr/>
+      </w:pPr>
+      <w:r>
+        <w:rPr>
+          <w:rtl w:val="0"/>
+        </w:rPr>
+        <w:t>La humedad es el último filtro antes del cierre del ingreso. Si aplica y no hay humedad digitada, no cierres el caso hasta registrar o escalar.</w:t>
+      </w:r>
+    </w:p>
+    <w:p>
+      <w:pPr>
+        <w:spacing w:after="120" w:lineRule="auto"/>
+        <w:rPr/>
+      </w:pPr>
+      <w:r>
+        <w:rPr>
+          <w:rtl w:val="0"/>
+        </w:rPr>
+        <w:t>Si la muestra se pierde, se daña o no llega al laboratorio, avisa al supervisor y deja el caso identificado para remuestreo o decisión; no inventes el dato.</w:t>
+      </w:r>
+    </w:p>
+    <w:p>
+      <w:pPr>
+        <w:spacing w:after="120" w:lineRule="auto"/>
+        <w:rPr/>
+      </w:pPr>
+      <w:r>
+        <w:rPr>
+          <w:rtl w:val="0"/>
+        </w:rPr>
+        <w:t>En salida por Balanza 1, verifica que la humedad esté digitada antes de liberar el cierre cuando aplique.</w:t>
+      </w:r>
+    </w:p>
+    <w:p>
+      <w:pPr>
+        <w:rPr/>
+      </w:pPr>
+      <w:r>
+        <w:br w:type="page"/>
+      </w:r>
+      <w:r>
+        <w:rPr>
+          <w:rtl w:val="0"/>
+        </w:rPr>
+      </w:r>
+    </w:p>
+    <w:p>
+      <w:pPr>
+        <w:pStyle w:val="Heading1"/>
+        <w:spacing w:after="200" w:before="320" w:lineRule="auto"/>
+        <w:rPr/>
+      </w:pPr>
+      <w:r>
+        <w:rPr>
+          <w:b w:val="1"/>
+          <w:bCs w:val="1"/>
+          <w:color w:val="173404"/>
+          <w:rtl w:val="0"/>
+        </w:rPr>
         <w:t xml:space="preserve">Cuándo hacer ingreso manual</w:t>
       </w:r>
       <w:r>
@@ -5620,7 +5524,7 @@
         <w:rPr>
           <w:rtl w:val="0"/>
         </w:rPr>
-        <w:t xml:space="preserve">Cuando el QR falla o la cuenta del proveedor no tiene contrato, llenas todo a mano. Los dos casos son:</w:t>
+        <w:t>Cuando falla el QR forestal, no hay código de barras de terceros o la cuenta del proveedor no tiene contrato, llenas todo a mano. Los casos principales son:</w:t>
       </w:r>
     </w:p>
     <w:p>
@@ -5632,7 +5536,7 @@
         <w:rPr>
           <w:rtl w:val="0"/>
         </w:rPr>
-        <w:t xml:space="preserve">Importante: si haces un ingreso manual, avisa a supervisores. Lo ideal es que todo ingreso sea por QR.</w:t>
+        <w:t>Importante: si haces un ingreso manual, avisa a supervisores. Lo ideal es usar QR forestal para propios/vuelo o código de barras para terceros cuando exista.</w:t>
       </w:r>
     </w:p>
     <w:p>
@@ -5675,7 +5579,7 @@
           <w:vertAlign w:val="baseline"/>
           <w:rtl w:val="0"/>
         </w:rPr>
-        <w:t xml:space="preserve">El QR no funciona o tiene datos malos</w:t>
+        <w:t>El QR forestal no funciona o tiene datos malos</w:t>
       </w:r>
     </w:p>
     <w:p>
@@ -5718,42 +5622,7 @@
           <w:vertAlign w:val="baseline"/>
           <w:rtl w:val="0"/>
         </w:rPr>
-        <w:t xml:space="preserve">El proveedor no tiene contrato registrado, solo cuenta</w:t>
-      </w:r>
-    </w:p>
-    <w:p>
-      <w:pPr>
-        <w:pBdr>
-          <w:bottom w:color="bbbbbb" w:space="8" w:sz="12" w:val="single"/>
-        </w:pBdr>
-        <w:spacing w:after="200" w:before="200" w:lineRule="auto"/>
-        <w:rPr/>
-      </w:pPr>
-      <w:r>
-        <w:rPr>
-          <w:rtl w:val="0"/>
-        </w:rPr>
-      </w:r>
-    </w:p>
-    <w:p>
-      <w:pPr>
-        <w:pStyle w:val="Heading1"/>
-        <w:spacing w:after="200" w:before="320" w:lineRule="auto"/>
-        <w:rPr/>
-      </w:pPr>
-      <w:r>
-        <w:rPr>
-          <w:b w:val="1"/>
-          <w:bCs w:val="1"/>
-          <w:color w:val="173404"/>
-          <w:rtl w:val="0"/>
-        </w:rPr>
-        <w:t xml:space="preserve">Cuándo se anula un ingreso</w:t>
-      </w:r>
-      <w:r>
-        <w:rPr>
-          <w:rtl w:val="0"/>
-        </w:rPr>
+        <w:t>El código de barras de terceros no existe, no funciona o tiene datos malos</w:t>
       </w:r>
     </w:p>
     <w:p>
@@ -5796,7 +5665,37 @@
           <w:vertAlign w:val="baseline"/>
           <w:rtl w:val="0"/>
         </w:rPr>
-        <w:t xml:space="preserve">El precio varió respecto al acuerdo</w:t>
+        <w:t xml:space="preserve">El proveedor no tiene contrato registrado, solo cuenta</w:t>
+      </w:r>
+    </w:p>
+    <w:p>
+      <w:pPr>
+        <w:pBdr>
+          <w:bottom w:color="bbbbbb" w:space="8" w:sz="12" w:val="single"/>
+        </w:pBdr>
+        <w:spacing w:after="200" w:before="200" w:lineRule="auto"/>
+        <w:rPr/>
+      </w:pPr>
+      <w:r>
+        <w:rPr>
+          <w:rtl w:val="0"/>
+        </w:rPr>
+      </w:r>
+    </w:p>
+    <w:p>
+      <w:pPr>
+        <w:pStyle w:val="Heading1"/>
+        <w:spacing w:after="200" w:before="320" w:lineRule="auto"/>
+        <w:rPr/>
+      </w:pPr>
+      <w:r>
+        <w:rPr>
+          <w:b w:val="1"/>
+          <w:bCs w:val="1"/>
+          <w:color w:val="173404"/>
+          <w:rtl w:val="0"/>
+        </w:rPr>
+        <w:t>Cuándo se anula, reliquida o pide nota de crédito</w:t>
       </w:r>
     </w:p>
     <w:p>
@@ -5839,7 +5738,7 @@
           <w:vertAlign w:val="baseline"/>
           <w:rtl w:val="0"/>
         </w:rPr>
-        <w:t xml:space="preserve">Hubo error al escribir los datos manuales</w:t>
+        <w:t>Anulación: datos equivocados de QR forestal, código de barras, placa/proveedor/categoría/material, precio o integración ANI-INFOR.</w:t>
       </w:r>
     </w:p>
     <w:p>
@@ -5882,7 +5781,50 @@
           <w:vertAlign w:val="baseline"/>
           <w:rtl w:val="0"/>
         </w:rPr>
-        <w:t xml:space="preserve">El sistema ANI no se integró con INFOR</w:t>
+        <w:t>Reliquidación: si se pagó de menos por categoría, precio u otro dato mal aplicado, el proveedor emite factura por el faltante.</w:t>
+      </w:r>
+    </w:p>
+    <w:p>
+      <w:pPr>
+        <w:keepNext w:val="0"/>
+        <w:keepLines w:val="0"/>
+        <w:pageBreakBefore w:val="0"/>
+        <w:widowControl w:val="1"/>
+        <w:numPr>
+          <w:ilvl w:val="0"/>
+          <w:numId w:val="1"/>
+        </w:numPr>
+        <w:pBdr>
+          <w:top w:space="0" w:sz="0" w:val="nil"/>
+          <w:left w:space="0" w:sz="0" w:val="nil"/>
+          <w:bottom w:space="0" w:sz="0" w:val="nil"/>
+          <w:right w:space="0" w:sz="0" w:val="nil"/>
+          <w:between w:space="0" w:sz="0" w:val="nil"/>
+        </w:pBdr>
+        <w:shd w:fill="auto" w:val="clear"/>
+        <w:spacing w:after="0" w:before="0" w:line="240" w:lineRule="auto"/>
+        <w:ind w:left="720" w:right="0" w:hanging="360"/>
+        <w:jc w:val="left"/>
+        <w:rPr/>
+      </w:pPr>
+      <w:r>
+        <w:rPr>
+          <w:rFonts w:ascii="Arial" w:cs="Arial" w:eastAsia="Arial" w:hAnsi="Arial"/>
+          <w:b w:val="0"/>
+          <w:bCs w:val="0"/>
+          <w:i w:val="0"/>
+          <w:iCs w:val="0"/>
+          <w:smallCaps w:val="0"/>
+          <w:strike w:val="0"/>
+          <w:color w:val="000000"/>
+          <w:sz w:val="22"/>
+          <w:szCs w:val="22"/>
+          <w:u w:val="none"/>
+          <w:shd w:fill="auto" w:val="clear"/>
+          <w:vertAlign w:val="baseline"/>
+          <w:rtl w:val="0"/>
+        </w:rPr>
+        <w:t>Nota de crédito: si se pagó de más, se solicita nota de crédito para reversar la diferencia.</w:t>
       </w:r>
     </w:p>
     <w:p>
@@ -5897,12 +5839,7 @@
           <w:color w:val="5f5e5a"/>
           <w:rtl w:val="0"/>
         </w:rPr>
-        <w:t xml:space="preserve">Pendiente: lista de precios para verificación.</w:t>
-      </w:r>
-      <w:r>
-        <w:rPr>
-          <w:rtl w:val="0"/>
-        </w:rPr>
+        <w:t>Escalar a supervisor, Daniel o Contabilidad según el caso; validar lista de precios cuando aplique.</w:t>
       </w:r>
     </w:p>
     <w:p/>
@@ -5940,6 +5877,11 @@
       </w:r>
     </w:p>
     <w:p>
+      <w:r>
+        <w:t>• Si el operador descarga en patio/ruma fuera de secuencia, debe avisar; si se crea una ruma física nueva que no existe digitalmente, pedir habilitación al jefe de patios o responsable definido.</w:t>
+      </w:r>
+    </w:p>
+    <w:p>
       <w:pPr>
         <w:pStyle w:val="Heading1"/>
       </w:pPr>
@@ -5952,7 +5894,7 @@
         <w:pStyle w:val="Normal"/>
       </w:pPr>
       <w:r>
-        <w:t xml:space="preserve">Última actualización: 2026-06-19 09:53 (-05 ECT) — Editor: Manuel Montúfar</w:t>
+        <w:t>Última actualización: 2026-06-19 16:07 (-05 ECT) — Editor: Manuel Montúfar / Codex</w:t>
       </w:r>
     </w:p>
     <w:p>
@@ -5960,7 +5902,7 @@
         <w:pStyle w:val="Normal"/>
       </w:pPr>
       <w:r>
-        <w:t xml:space="preserve">Fuente única de verdad: docs-finales/CONTENIDO_MAESTRO.md</w:t>
+        <w:t>Fuente única de verdad: instructivos/finales/CONTENIDO_MAESTRO.md</w:t>
       </w:r>
     </w:p>
     <w:p>
@@ -5968,6 +5910,22 @@
         <w:pStyle w:val="Heading2"/>
       </w:pPr>
       <w:r>
+        <w:t>2026-06-19 16:07 (-05 ECT) — Manuel Montúfar / Codex</w:t>
+      </w:r>
+    </w:p>
+    <w:p>
+      <w:pPr>
+        <w:pStyle w:val="Normal"/>
+      </w:pPr>
+      <w:r>
+        <w:t>Guía rápida alineada: QR forestal vs código de barras terceros; guía repetida bloquea entrada; humedad/muestra perdida; patios/rumas digitales; anulación/reliquidación/nota crédito.</w:t>
+      </w:r>
+    </w:p>
+    <w:p>
+      <w:pPr>
+        <w:pStyle w:val="Heading2"/>
+      </w:pPr>
+      <w:r>
         <w:t xml:space="preserve">2026-06-19 09:53 (-05 ECT) — Manuel Montúfar</w:t>
       </w:r>
     </w:p>
@@ -6040,7 +5998,7 @@
         <w:pStyle w:val="Normal"/>
       </w:pPr>
       <w:r>
-        <w:t xml:space="preserve">Por validar con Daniel Sotalin: punto exacto en ANI donde la humedad bloquea edición; procedimiento detallado de anulación.</w:t>
+        <w:t>Pendiente: re-exportar PDF final después de validar/actualizar DOCX; no queda pendiente no aprobado sobre ubicación exacta de bloqueo por humedad.</w:t>
       </w:r>
     </w:p>
     <w:sectPr>

</xml_diff>

<commit_message>
Finish Gabriel deliverable rebuild (#7)
</commit_message>
<xml_diff>
--- a/instructivos/finales/RECEPCION_DE_MADERA_guia_v2_ACTUALIZADO_2026-06-19.docx
+++ b/instructivos/finales/RECEPCION_DE_MADERA_guia_v2_ACTUALIZADO_2026-06-19.docx
@@ -474,7 +474,7 @@
                 <w:vertAlign w:val="baseline"/>
                 <w:rtl w:val="0"/>
               </w:rPr>
-              <w:t xml:space="preserve">Ingresos Terceros — con QR</w:t>
+              <w:t xml:space="preserve">Ingresos Terceros — con código de barras</w:t>
               <w:tab/>
               <w:t xml:space="preserve">8</w:t>
             </w:r>
@@ -685,7 +685,7 @@
                 <w:vertAlign w:val="baseline"/>
                 <w:rtl w:val="0"/>
               </w:rPr>
-              <w:t xml:space="preserve">Ingresos Terceros — sin QR</w:t>
+              <w:t xml:space="preserve">Ingresos Terceros — sin código de barras</w:t>
               <w:tab/>
               <w:t xml:space="preserve">11</w:t>
             </w:r>
@@ -1527,7 +1527,7 @@
         <w:rPr>
           <w:rtl w:val="0"/>
         </w:rPr>
-        <w:t xml:space="preserve">Para recibir madera usamos el sistema ANI y dos balanzas que pesan el camión solas. Hay tres tipos de ingreso: Propios, Vuelo Forestal y Terceros. Cada uno se puede hacer con QR (rápido) o sin QR (manual).</w:t>
+        <w:t>Para recibir madera usamos el sistema ANI y dos balanzas que pesan el camión solas. Hay tres tipos de ingreso: Propios, Vuelo Forestal y Terceros. Propios y Vuelo Forestal usan QR forestal cuando existe; Terceros usa código de barras del proveedor. Si no hay QR forestal o código de barras, el ingreso se llena manualmente.</w:t>
       </w:r>
     </w:p>
     <w:p>
@@ -2017,39 +2017,7 @@
         <w:rPr>
           <w:rtl w:val="0"/>
         </w:rPr>
-        <w:t xml:space="preserve">Cuando los campos estén listos, aprieta </w:t>
-      </w:r>
-      <w:r>
-        <w:rPr>
-          <w:rFonts w:ascii="Consolas" w:cs="Consolas" w:eastAsia="Consolas" w:hAnsi="Consolas"/>
-          <w:b w:val="1"/>
-          <w:bCs w:val="1"/>
-          <w:shd w:fill="f5f5f5" w:val="clear"/>
-          <w:rtl w:val="0"/>
-        </w:rPr>
-        <w:t xml:space="preserve"> F4 </w:t>
-      </w:r>
-      <w:r>
-        <w:rPr>
-          <w:rtl w:val="0"/>
-        </w:rPr>
-        <w:t xml:space="preserve">. La balanza pasa el peso al sistema. Confirmas con </w:t>
-      </w:r>
-      <w:r>
-        <w:rPr>
-          <w:rFonts w:ascii="Consolas" w:cs="Consolas" w:eastAsia="Consolas" w:hAnsi="Consolas"/>
-          <w:b w:val="1"/>
-          <w:bCs w:val="1"/>
-          <w:shd w:fill="f5f5f5" w:val="clear"/>
-          <w:rtl w:val="0"/>
-        </w:rPr>
-        <w:t xml:space="preserve"> OK </w:t>
-      </w:r>
-      <w:r>
-        <w:rPr>
-          <w:rtl w:val="0"/>
-        </w:rPr>
-        <w:t xml:space="preserve">.</w:t>
+        <w:t xml:space="preserve">Cuando los datos mínimos estén completos y revisados, aprieta  F4 . La balanza pasa el peso al sistema. Confirmas con  OK .</w:t>
       </w:r>
     </w:p>
     <w:p>
@@ -2627,12 +2595,7 @@
           <w:color w:val="173404"/>
           <w:rtl w:val="0"/>
         </w:rPr>
-        <w:t xml:space="preserve">Ingresos Terceros — con QR</w:t>
-      </w:r>
-      <w:r>
-        <w:rPr>
-          <w:rtl w:val="0"/>
-        </w:rPr>
+        <w:t>Ingresos Terceros — con código de barras</w:t>
       </w:r>
     </w:p>
     <w:p>
@@ -2822,47 +2785,7 @@
           <w:szCs w:val="20"/>
           <w:rtl w:val="0"/>
         </w:rPr>
-        <w:t xml:space="preserve">Código de barras del proveedor — se autocompleta con el qr:</w:t>
-      </w:r>
-      <w:r>
-        <w:rPr/>
-        <w:drawing>
-          <wp:inline distB="0" distT="0" distL="0" distR="0">
-            <wp:extent cx="5715000" cy="276225"/>
-            <wp:effectExtent b="0" l="0" r="0" t="0"/>
-            <wp:docPr descr="image12.png" id="11" name="image1.png"/>
-            <a:graphic>
-              <a:graphicData uri="http://schemas.openxmlformats.org/drawingml/2006/picture">
-                <pic:pic>
-                  <pic:nvPicPr>
-                    <pic:cNvPr descr="image12.png" id="0" name="image1.png"/>
-                    <pic:cNvPicPr preferRelativeResize="0"/>
-                  </pic:nvPicPr>
-                  <pic:blipFill>
-                    <a:blip r:embed="rId19"/>
-                    <a:srcRect b="0" l="0" r="0" t="0"/>
-                    <a:stretch>
-                      <a:fillRect/>
-                    </a:stretch>
-                  </pic:blipFill>
-                  <pic:spPr>
-                    <a:xfrm>
-                      <a:off x="0" y="0"/>
-                      <a:ext cx="5715000" cy="276225"/>
-                    </a:xfrm>
-                    <a:prstGeom prst="rect"/>
-                    <a:ln/>
-                  </pic:spPr>
-                </pic:pic>
-              </a:graphicData>
-            </a:graphic>
-          </wp:inline>
-        </w:drawing>
-      </w:r>
-      <w:r>
-        <w:rPr>
-          <w:rtl w:val="0"/>
-        </w:rPr>
+        <w:t>Código de barras del proveedor — ayuda a completar datos del proveedor:</w:t>
       </w:r>
     </w:p>
     <w:p>
@@ -3121,23 +3044,7 @@
         <w:rPr>
           <w:rtl w:val="0"/>
         </w:rPr>
-        <w:t xml:space="preserve">Aprieta </w:t>
-      </w:r>
-      <w:r>
-        <w:rPr>
-          <w:rFonts w:ascii="Consolas" w:cs="Consolas" w:eastAsia="Consolas" w:hAnsi="Consolas"/>
-          <w:b w:val="1"/>
-          <w:bCs w:val="1"/>
-          <w:shd w:fill="f5f5f5" w:val="clear"/>
-          <w:rtl w:val="0"/>
-        </w:rPr>
-        <w:t xml:space="preserve"> F4 </w:t>
-      </w:r>
-      <w:r>
-        <w:rPr>
-          <w:rtl w:val="0"/>
-        </w:rPr>
-        <w:t xml:space="preserve"> para que la balanza pase el peso. Verifica primero que el peso de balanza esté en 0.</w:t>
+        <w:t xml:space="preserve">Cuando los datos mínimos estén completos y revisados, aprieta  F4  para que la balanza pase el peso. Verifica primero que el peso de balanza esté en 0.</w:t>
       </w:r>
     </w:p>
     <w:p>
@@ -3370,12 +3277,7 @@
           <w:color w:val="173404"/>
           <w:rtl w:val="0"/>
         </w:rPr>
-        <w:t xml:space="preserve">Ingresos Terceros — sin QR</w:t>
-      </w:r>
-      <w:r>
-        <w:rPr>
-          <w:rtl w:val="0"/>
-        </w:rPr>
+        <w:t>Ingresos Terceros — sin código de barras</w:t>
       </w:r>
     </w:p>
     <w:p>
@@ -3387,7 +3289,7 @@
         <w:rPr>
           <w:rtl w:val="0"/>
         </w:rPr>
-        <w:t xml:space="preserve">Si el QR no sirve o no está, el ingreso lo haces a mano. Llenas tú lo que normalmente traería el QR.</w:t>
+        <w:t>Si el código de barras no está o no sirve, el ingreso lo haces a mano: placa, proveedor, guía, transportista, material, categoría y ubicación.</w:t>
       </w:r>
     </w:p>
     <w:p>
@@ -3824,55 +3726,7 @@
         <w:rPr>
           <w:rtl w:val="0"/>
         </w:rPr>
-        <w:t xml:space="preserve">Verifica que el peso de balanza esté en 0. Aprieta </w:t>
-      </w:r>
-      <w:r>
-        <w:rPr>
-          <w:rFonts w:ascii="Consolas" w:cs="Consolas" w:eastAsia="Consolas" w:hAnsi="Consolas"/>
-          <w:b w:val="1"/>
-          <w:bCs w:val="1"/>
-          <w:shd w:fill="f5f5f5" w:val="clear"/>
-          <w:rtl w:val="0"/>
-        </w:rPr>
-        <w:t xml:space="preserve"> F4 </w:t>
-      </w:r>
-      <w:r>
-        <w:rPr>
-          <w:rtl w:val="0"/>
-        </w:rPr>
-        <w:t xml:space="preserve"> para capturar el peso, confirma con </w:t>
-      </w:r>
-      <w:r>
-        <w:rPr>
-          <w:rFonts w:ascii="Consolas" w:cs="Consolas" w:eastAsia="Consolas" w:hAnsi="Consolas"/>
-          <w:b w:val="1"/>
-          <w:bCs w:val="1"/>
-          <w:shd w:fill="f5f5f5" w:val="clear"/>
-          <w:rtl w:val="0"/>
-        </w:rPr>
-        <w:t xml:space="preserve"> OK </w:t>
-      </w:r>
-      <w:r>
-        <w:rPr>
-          <w:rtl w:val="0"/>
-        </w:rPr>
-        <w:t xml:space="preserve"> o </w:t>
-      </w:r>
-      <w:r>
-        <w:rPr>
-          <w:rFonts w:ascii="Consolas" w:cs="Consolas" w:eastAsia="Consolas" w:hAnsi="Consolas"/>
-          <w:b w:val="1"/>
-          <w:bCs w:val="1"/>
-          <w:shd w:fill="f5f5f5" w:val="clear"/>
-          <w:rtl w:val="0"/>
-        </w:rPr>
-        <w:t xml:space="preserve"> F12 </w:t>
-      </w:r>
-      <w:r>
-        <w:rPr>
-          <w:rtl w:val="0"/>
-        </w:rPr>
-        <w:t xml:space="preserve">.</w:t>
+        <w:t xml:space="preserve">Verifica que los datos mínimos estén completos y que la balanza esté en 0. Aprieta  F4  para capturar el peso, confirma con  OK  o  F12 .</w:t>
       </w:r>
     </w:p>
     <w:p>
@@ -4382,13 +4236,11 @@
         <w:pStyle w:val="Heading1"/>
         <w:rPr/>
       </w:pPr>
-      <w:bookmarkStart w:colFirst="0" w:colLast="0" w:name="_heading=h.bjsdk98omtz1" w:id="1"/>
-      <w:bookmarkEnd w:id="1"/>
-      <w:r>
-        <w:rPr>
-          <w:rtl w:val="0"/>
-        </w:rPr>
-        <w:t xml:space="preserve">Ingresos terceros — sin QR</w:t>
+      <w:r>
+        <w:rPr>
+          <w:rtl w:val="0"/>
+        </w:rPr>
+        <w:t>Ingresos terceros — sin código de barras</w:t>
       </w:r>
     </w:p>
     <w:p>
@@ -4400,7 +4252,7 @@
         <w:rPr>
           <w:rtl w:val="0"/>
         </w:rPr>
-        <w:t xml:space="preserve">Si el QR no sirve o no está, el ingreso lo haces a mano. Llenas tú lo que normalmente traería el QR.</w:t>
+        <w:t>Si el código de barras no está o no sirve, el ingreso lo haces a mano: placa, proveedor, guía, transportista, material, categoría y ubicación.</w:t>
       </w:r>
     </w:p>
     <w:p>
@@ -5398,7 +5250,7 @@
         <w:rPr>
           <w:rtl w:val="0"/>
         </w:rPr>
-        <w:t xml:space="preserve">ANI revisa solo que la guía no esté duplicada en el sistema. Si la rechaza:</w:t>
+        <w:t>ANI revisa que la guía no esté duplicada en el sistema y bloquea la entrada si ya existe. Si la rechaza:</w:t>
       </w:r>
     </w:p>
     <w:p>
@@ -5527,7 +5379,7 @@
           <w:vertAlign w:val="baseline"/>
           <w:rtl w:val="0"/>
         </w:rPr>
-        <w:t xml:space="preserve">No dejes descargar hasta que la guía sea válida</w:t>
+        <w:t>No dejes pasar el ingreso hasta que la guía sea válida</w:t>
       </w:r>
     </w:p>
     <w:p>
@@ -5579,19 +5431,6 @@
     </w:p>
     <w:p>
       <w:pPr>
-        <w:rPr/>
-      </w:pPr>
-      <w:r>
-        <w:br w:type="page"/>
-      </w:r>
-      <w:r>
-        <w:rPr>
-          <w:rtl w:val="0"/>
-        </w:rPr>
-      </w:r>
-    </w:p>
-    <w:p>
-      <w:pPr>
         <w:pStyle w:val="Heading1"/>
         <w:spacing w:after="200" w:before="320" w:lineRule="auto"/>
         <w:rPr/>
@@ -5603,6 +5442,71 @@
           <w:color w:val="173404"/>
           <w:rtl w:val="0"/>
         </w:rPr>
+        <w:t>Control de humedad y muestra</w:t>
+      </w:r>
+    </w:p>
+    <w:p>
+      <w:pPr>
+        <w:spacing w:after="120" w:lineRule="auto"/>
+        <w:rPr/>
+      </w:pPr>
+      <w:r>
+        <w:rPr>
+          <w:rtl w:val="0"/>
+        </w:rPr>
+        <w:t>La humedad es el último filtro antes del cierre del ingreso. Si aplica y no hay humedad digitada, no cierres el caso hasta registrar o escalar.</w:t>
+      </w:r>
+    </w:p>
+    <w:p>
+      <w:pPr>
+        <w:spacing w:after="120" w:lineRule="auto"/>
+        <w:rPr/>
+      </w:pPr>
+      <w:r>
+        <w:rPr>
+          <w:rtl w:val="0"/>
+        </w:rPr>
+        <w:t>Si la muestra se pierde, se daña o no llega al laboratorio, avisa al supervisor y deja el caso identificado para remuestreo o decisión; no inventes el dato.</w:t>
+      </w:r>
+    </w:p>
+    <w:p>
+      <w:pPr>
+        <w:spacing w:after="120" w:lineRule="auto"/>
+        <w:rPr/>
+      </w:pPr>
+      <w:r>
+        <w:rPr>
+          <w:rtl w:val="0"/>
+        </w:rPr>
+        <w:t>En salida por Balanza 1, verifica que la humedad esté digitada antes de liberar el cierre cuando aplique.</w:t>
+      </w:r>
+    </w:p>
+    <w:p>
+      <w:pPr>
+        <w:rPr/>
+      </w:pPr>
+      <w:r>
+        <w:br w:type="page"/>
+      </w:r>
+      <w:r>
+        <w:rPr>
+          <w:rtl w:val="0"/>
+        </w:rPr>
+      </w:r>
+    </w:p>
+    <w:p>
+      <w:pPr>
+        <w:pStyle w:val="Heading1"/>
+        <w:spacing w:after="200" w:before="320" w:lineRule="auto"/>
+        <w:rPr/>
+      </w:pPr>
+      <w:r>
+        <w:rPr>
+          <w:b w:val="1"/>
+          <w:bCs w:val="1"/>
+          <w:color w:val="173404"/>
+          <w:rtl w:val="0"/>
+        </w:rPr>
         <w:t xml:space="preserve">Cuándo hacer ingreso manual</w:t>
       </w:r>
       <w:r>
@@ -5620,7 +5524,7 @@
         <w:rPr>
           <w:rtl w:val="0"/>
         </w:rPr>
-        <w:t xml:space="preserve">Cuando el QR falla o la cuenta del proveedor no tiene contrato, llenas todo a mano. Los dos casos son:</w:t>
+        <w:t>Cuando falla el QR forestal, no hay código de barras de terceros o la cuenta del proveedor no tiene contrato, llenas todo a mano. Los casos principales son:</w:t>
       </w:r>
     </w:p>
     <w:p>
@@ -5632,7 +5536,7 @@
         <w:rPr>
           <w:rtl w:val="0"/>
         </w:rPr>
-        <w:t xml:space="preserve">Importante: si haces un ingreso manual, avisa a supervisores. Lo ideal es que todo ingreso sea por QR.</w:t>
+        <w:t>Importante: si haces un ingreso manual, avisa a supervisores. Lo ideal es usar QR forestal para propios/vuelo o código de barras para terceros cuando exista.</w:t>
       </w:r>
     </w:p>
     <w:p>
@@ -5675,7 +5579,7 @@
           <w:vertAlign w:val="baseline"/>
           <w:rtl w:val="0"/>
         </w:rPr>
-        <w:t xml:space="preserve">El QR no funciona o tiene datos malos</w:t>
+        <w:t>El QR forestal no funciona o tiene datos malos</w:t>
       </w:r>
     </w:p>
     <w:p>
@@ -5718,42 +5622,7 @@
           <w:vertAlign w:val="baseline"/>
           <w:rtl w:val="0"/>
         </w:rPr>
-        <w:t xml:space="preserve">El proveedor no tiene contrato registrado, solo cuenta</w:t>
-      </w:r>
-    </w:p>
-    <w:p>
-      <w:pPr>
-        <w:pBdr>
-          <w:bottom w:color="bbbbbb" w:space="8" w:sz="12" w:val="single"/>
-        </w:pBdr>
-        <w:spacing w:after="200" w:before="200" w:lineRule="auto"/>
-        <w:rPr/>
-      </w:pPr>
-      <w:r>
-        <w:rPr>
-          <w:rtl w:val="0"/>
-        </w:rPr>
-      </w:r>
-    </w:p>
-    <w:p>
-      <w:pPr>
-        <w:pStyle w:val="Heading1"/>
-        <w:spacing w:after="200" w:before="320" w:lineRule="auto"/>
-        <w:rPr/>
-      </w:pPr>
-      <w:r>
-        <w:rPr>
-          <w:b w:val="1"/>
-          <w:bCs w:val="1"/>
-          <w:color w:val="173404"/>
-          <w:rtl w:val="0"/>
-        </w:rPr>
-        <w:t xml:space="preserve">Cuándo se anula un ingreso</w:t>
-      </w:r>
-      <w:r>
-        <w:rPr>
-          <w:rtl w:val="0"/>
-        </w:rPr>
+        <w:t>El código de barras de terceros no existe, no funciona o tiene datos malos</w:t>
       </w:r>
     </w:p>
     <w:p>
@@ -5796,7 +5665,37 @@
           <w:vertAlign w:val="baseline"/>
           <w:rtl w:val="0"/>
         </w:rPr>
-        <w:t xml:space="preserve">El precio varió respecto al acuerdo</w:t>
+        <w:t xml:space="preserve">El proveedor no tiene contrato registrado, solo cuenta</w:t>
+      </w:r>
+    </w:p>
+    <w:p>
+      <w:pPr>
+        <w:pBdr>
+          <w:bottom w:color="bbbbbb" w:space="8" w:sz="12" w:val="single"/>
+        </w:pBdr>
+        <w:spacing w:after="200" w:before="200" w:lineRule="auto"/>
+        <w:rPr/>
+      </w:pPr>
+      <w:r>
+        <w:rPr>
+          <w:rtl w:val="0"/>
+        </w:rPr>
+      </w:r>
+    </w:p>
+    <w:p>
+      <w:pPr>
+        <w:pStyle w:val="Heading1"/>
+        <w:spacing w:after="200" w:before="320" w:lineRule="auto"/>
+        <w:rPr/>
+      </w:pPr>
+      <w:r>
+        <w:rPr>
+          <w:b w:val="1"/>
+          <w:bCs w:val="1"/>
+          <w:color w:val="173404"/>
+          <w:rtl w:val="0"/>
+        </w:rPr>
+        <w:t>Cuándo se anula, reliquida o pide nota de crédito</w:t>
       </w:r>
     </w:p>
     <w:p>
@@ -5839,7 +5738,7 @@
           <w:vertAlign w:val="baseline"/>
           <w:rtl w:val="0"/>
         </w:rPr>
-        <w:t xml:space="preserve">Hubo error al escribir los datos manuales</w:t>
+        <w:t>Anulación: datos equivocados de QR forestal, código de barras, placa/proveedor/categoría/material, precio o integración ANI-INFOR.</w:t>
       </w:r>
     </w:p>
     <w:p>
@@ -5882,7 +5781,50 @@
           <w:vertAlign w:val="baseline"/>
           <w:rtl w:val="0"/>
         </w:rPr>
-        <w:t xml:space="preserve">El sistema ANI no se integró con INFOR</w:t>
+        <w:t>Reliquidación: si se pagó de menos por categoría, precio u otro dato mal aplicado, el proveedor emite factura por el faltante.</w:t>
+      </w:r>
+    </w:p>
+    <w:p>
+      <w:pPr>
+        <w:keepNext w:val="0"/>
+        <w:keepLines w:val="0"/>
+        <w:pageBreakBefore w:val="0"/>
+        <w:widowControl w:val="1"/>
+        <w:numPr>
+          <w:ilvl w:val="0"/>
+          <w:numId w:val="1"/>
+        </w:numPr>
+        <w:pBdr>
+          <w:top w:space="0" w:sz="0" w:val="nil"/>
+          <w:left w:space="0" w:sz="0" w:val="nil"/>
+          <w:bottom w:space="0" w:sz="0" w:val="nil"/>
+          <w:right w:space="0" w:sz="0" w:val="nil"/>
+          <w:between w:space="0" w:sz="0" w:val="nil"/>
+        </w:pBdr>
+        <w:shd w:fill="auto" w:val="clear"/>
+        <w:spacing w:after="0" w:before="0" w:line="240" w:lineRule="auto"/>
+        <w:ind w:left="720" w:right="0" w:hanging="360"/>
+        <w:jc w:val="left"/>
+        <w:rPr/>
+      </w:pPr>
+      <w:r>
+        <w:rPr>
+          <w:rFonts w:ascii="Arial" w:cs="Arial" w:eastAsia="Arial" w:hAnsi="Arial"/>
+          <w:b w:val="0"/>
+          <w:bCs w:val="0"/>
+          <w:i w:val="0"/>
+          <w:iCs w:val="0"/>
+          <w:smallCaps w:val="0"/>
+          <w:strike w:val="0"/>
+          <w:color w:val="000000"/>
+          <w:sz w:val="22"/>
+          <w:szCs w:val="22"/>
+          <w:u w:val="none"/>
+          <w:shd w:fill="auto" w:val="clear"/>
+          <w:vertAlign w:val="baseline"/>
+          <w:rtl w:val="0"/>
+        </w:rPr>
+        <w:t>Nota de crédito: si se pagó de más, se solicita nota de crédito para reversar la diferencia.</w:t>
       </w:r>
     </w:p>
     <w:p>
@@ -5897,12 +5839,7 @@
           <w:color w:val="5f5e5a"/>
           <w:rtl w:val="0"/>
         </w:rPr>
-        <w:t xml:space="preserve">Pendiente: lista de precios para verificación.</w:t>
-      </w:r>
-      <w:r>
-        <w:rPr>
-          <w:rtl w:val="0"/>
-        </w:rPr>
+        <w:t>Escalar a supervisor, Daniel o Contabilidad según el caso; validar lista de precios cuando aplique.</w:t>
       </w:r>
     </w:p>
     <w:p/>
@@ -5940,6 +5877,11 @@
       </w:r>
     </w:p>
     <w:p>
+      <w:r>
+        <w:t>• Si el operador descarga en patio/ruma fuera de secuencia, debe avisar; si se crea una ruma física nueva que no existe digitalmente, pedir habilitación al jefe de patios o responsable definido.</w:t>
+      </w:r>
+    </w:p>
+    <w:p>
       <w:pPr>
         <w:pStyle w:val="Heading1"/>
       </w:pPr>
@@ -5952,7 +5894,7 @@
         <w:pStyle w:val="Normal"/>
       </w:pPr>
       <w:r>
-        <w:t xml:space="preserve">Última actualización: 2026-06-19 09:53 (-05 ECT) — Editor: Manuel Montúfar</w:t>
+        <w:t>Última actualización: 2026-06-19 16:07 (-05 ECT) — Editor: Manuel Montúfar / Codex</w:t>
       </w:r>
     </w:p>
     <w:p>
@@ -5960,7 +5902,7 @@
         <w:pStyle w:val="Normal"/>
       </w:pPr>
       <w:r>
-        <w:t xml:space="preserve">Fuente única de verdad: docs-finales/CONTENIDO_MAESTRO.md</w:t>
+        <w:t>Fuente única de verdad: instructivos/finales/CONTENIDO_MAESTRO.md</w:t>
       </w:r>
     </w:p>
     <w:p>
@@ -5968,6 +5910,22 @@
         <w:pStyle w:val="Heading2"/>
       </w:pPr>
       <w:r>
+        <w:t>2026-06-19 16:07 (-05 ECT) — Manuel Montúfar / Codex</w:t>
+      </w:r>
+    </w:p>
+    <w:p>
+      <w:pPr>
+        <w:pStyle w:val="Normal"/>
+      </w:pPr>
+      <w:r>
+        <w:t>Guía rápida alineada: QR forestal vs código de barras terceros; guía repetida bloquea entrada; humedad/muestra perdida; patios/rumas digitales; anulación/reliquidación/nota crédito.</w:t>
+      </w:r>
+    </w:p>
+    <w:p>
+      <w:pPr>
+        <w:pStyle w:val="Heading2"/>
+      </w:pPr>
+      <w:r>
         <w:t xml:space="preserve">2026-06-19 09:53 (-05 ECT) — Manuel Montúfar</w:t>
       </w:r>
     </w:p>
@@ -6040,7 +5998,7 @@
         <w:pStyle w:val="Normal"/>
       </w:pPr>
       <w:r>
-        <w:t xml:space="preserve">Por validar con Daniel Sotalin: punto exacto en ANI donde la humedad bloquea edición; procedimiento detallado de anulación.</w:t>
+        <w:t>Pendiente: re-exportar PDF final después de validar/actualizar DOCX; no queda pendiente no aprobado sobre ubicación exacta de bloqueo por humedad.</w:t>
       </w:r>
     </w:p>
     <w:sectPr>

</xml_diff>